<commit_message>
results with patna as covaraite
</commit_message>
<xml_diff>
--- a/model output/moderation_loksabha_overall_cardinality.docx
+++ b/model output/moderation_loksabha_overall_cardinality.docx
@@ -116,62 +116,62 @@
               <w:pStyle w:val="Compact"/>
             </w:pPr>
             <w:r>
-              <w:t xml:space="preserve">28.028***</w:t>
-            </w:r>
-          </w:p>
-        </w:tc>
-        <w:tc>
-          <w:tcPr/>
-          <w:p>
-            <w:pPr>
-              <w:pStyle w:val="Compact"/>
-            </w:pPr>
-            <w:r>
-              <w:t xml:space="preserve">5.676***</w:t>
-            </w:r>
-          </w:p>
-        </w:tc>
-        <w:tc>
-          <w:tcPr/>
-          <w:p>
-            <w:pPr>
-              <w:pStyle w:val="Compact"/>
-            </w:pPr>
-            <w:r>
-              <w:t xml:space="preserve">5.682***</w:t>
-            </w:r>
-          </w:p>
-        </w:tc>
-        <w:tc>
-          <w:tcPr/>
-          <w:p>
-            <w:pPr>
-              <w:pStyle w:val="Compact"/>
-            </w:pPr>
-            <w:r>
-              <w:t xml:space="preserve">5.614***</w:t>
-            </w:r>
-          </w:p>
-        </w:tc>
-        <w:tc>
-          <w:tcPr/>
-          <w:p>
-            <w:pPr>
-              <w:pStyle w:val="Compact"/>
-            </w:pPr>
-            <w:r>
-              <w:t xml:space="preserve">5.483***</w:t>
-            </w:r>
-          </w:p>
-        </w:tc>
-        <w:tc>
-          <w:tcPr/>
-          <w:p>
-            <w:pPr>
-              <w:pStyle w:val="Compact"/>
-            </w:pPr>
-            <w:r>
-              <w:t xml:space="preserve">5.573***</w:t>
+              <w:t xml:space="preserve">29.038***</w:t>
+            </w:r>
+          </w:p>
+        </w:tc>
+        <w:tc>
+          <w:tcPr/>
+          <w:p>
+            <w:pPr>
+              <w:pStyle w:val="Compact"/>
+            </w:pPr>
+            <w:r>
+              <w:t xml:space="preserve">6.007***</w:t>
+            </w:r>
+          </w:p>
+        </w:tc>
+        <w:tc>
+          <w:tcPr/>
+          <w:p>
+            <w:pPr>
+              <w:pStyle w:val="Compact"/>
+            </w:pPr>
+            <w:r>
+              <w:t xml:space="preserve">5.900***</w:t>
+            </w:r>
+          </w:p>
+        </w:tc>
+        <w:tc>
+          <w:tcPr/>
+          <w:p>
+            <w:pPr>
+              <w:pStyle w:val="Compact"/>
+            </w:pPr>
+            <w:r>
+              <w:t xml:space="preserve">5.804***</w:t>
+            </w:r>
+          </w:p>
+        </w:tc>
+        <w:tc>
+          <w:tcPr/>
+          <w:p>
+            <w:pPr>
+              <w:pStyle w:val="Compact"/>
+            </w:pPr>
+            <w:r>
+              <w:t xml:space="preserve">5.644***</w:t>
+            </w:r>
+          </w:p>
+        </w:tc>
+        <w:tc>
+          <w:tcPr/>
+          <w:p>
+            <w:pPr>
+              <w:pStyle w:val="Compact"/>
+            </w:pPr>
+            <w:r>
+              <w:t xml:space="preserve">5.683***</w:t>
             </w:r>
           </w:p>
         </w:tc>
@@ -192,62 +192,62 @@
               <w:pStyle w:val="Compact"/>
             </w:pPr>
             <w:r>
-              <w:t xml:space="preserve">28.028 (0.691)</w:t>
-            </w:r>
-          </w:p>
-        </w:tc>
-        <w:tc>
-          <w:tcPr/>
-          <w:p>
-            <w:pPr>
-              <w:pStyle w:val="Compact"/>
-            </w:pPr>
-            <w:r>
-              <w:t xml:space="preserve">5.676 (0.177)</w:t>
-            </w:r>
-          </w:p>
-        </w:tc>
-        <w:tc>
-          <w:tcPr/>
-          <w:p>
-            <w:pPr>
-              <w:pStyle w:val="Compact"/>
-            </w:pPr>
-            <w:r>
-              <w:t xml:space="preserve">5.682 (0.168)</w:t>
-            </w:r>
-          </w:p>
-        </w:tc>
-        <w:tc>
-          <w:tcPr/>
-          <w:p>
-            <w:pPr>
-              <w:pStyle w:val="Compact"/>
-            </w:pPr>
-            <w:r>
-              <w:t xml:space="preserve">5.614 (0.177)</w:t>
-            </w:r>
-          </w:p>
-        </w:tc>
-        <w:tc>
-          <w:tcPr/>
-          <w:p>
-            <w:pPr>
-              <w:pStyle w:val="Compact"/>
-            </w:pPr>
-            <w:r>
-              <w:t xml:space="preserve">5.483 (0.175)</w:t>
-            </w:r>
-          </w:p>
-        </w:tc>
-        <w:tc>
-          <w:tcPr/>
-          <w:p>
-            <w:pPr>
-              <w:pStyle w:val="Compact"/>
-            </w:pPr>
-            <w:r>
-              <w:t xml:space="preserve">5.573 (0.173)</w:t>
+              <w:t xml:space="preserve">29.038 (1.082)</w:t>
+            </w:r>
+          </w:p>
+        </w:tc>
+        <w:tc>
+          <w:tcPr/>
+          <w:p>
+            <w:pPr>
+              <w:pStyle w:val="Compact"/>
+            </w:pPr>
+            <w:r>
+              <w:t xml:space="preserve">6.007 (0.250)</w:t>
+            </w:r>
+          </w:p>
+        </w:tc>
+        <w:tc>
+          <w:tcPr/>
+          <w:p>
+            <w:pPr>
+              <w:pStyle w:val="Compact"/>
+            </w:pPr>
+            <w:r>
+              <w:t xml:space="preserve">5.900 (0.250)</w:t>
+            </w:r>
+          </w:p>
+        </w:tc>
+        <w:tc>
+          <w:tcPr/>
+          <w:p>
+            <w:pPr>
+              <w:pStyle w:val="Compact"/>
+            </w:pPr>
+            <w:r>
+              <w:t xml:space="preserve">5.804 (0.253)</w:t>
+            </w:r>
+          </w:p>
+        </w:tc>
+        <w:tc>
+          <w:tcPr/>
+          <w:p>
+            <w:pPr>
+              <w:pStyle w:val="Compact"/>
+            </w:pPr>
+            <w:r>
+              <w:t xml:space="preserve">5.644 (0.249)</w:t>
+            </w:r>
+          </w:p>
+        </w:tc>
+        <w:tc>
+          <w:tcPr/>
+          <w:p>
+            <w:pPr>
+              <w:pStyle w:val="Compact"/>
+            </w:pPr>
+            <w:r>
+              <w:t xml:space="preserve">5.683 (0.246)</w:t>
             </w:r>
           </w:p>
         </w:tc>
@@ -271,62 +271,62 @@
               <w:pStyle w:val="Compact"/>
             </w:pPr>
             <w:r>
-              <w:t xml:space="preserve">1.389</w:t>
-            </w:r>
-          </w:p>
-        </w:tc>
-        <w:tc>
-          <w:tcPr/>
-          <w:p>
-            <w:pPr>
-              <w:pStyle w:val="Compact"/>
-            </w:pPr>
-            <w:r>
-              <w:t xml:space="preserve">0.588*</w:t>
-            </w:r>
-          </w:p>
-        </w:tc>
-        <w:tc>
-          <w:tcPr/>
-          <w:p>
-            <w:pPr>
-              <w:pStyle w:val="Compact"/>
-            </w:pPr>
-            <w:r>
-              <w:t xml:space="preserve">0.353</w:t>
-            </w:r>
-          </w:p>
-        </w:tc>
-        <w:tc>
-          <w:tcPr/>
-          <w:p>
-            <w:pPr>
-              <w:pStyle w:val="Compact"/>
-            </w:pPr>
-            <w:r>
-              <w:t xml:space="preserve">0.275</w:t>
-            </w:r>
-          </w:p>
-        </w:tc>
-        <w:tc>
-          <w:tcPr/>
-          <w:p>
-            <w:pPr>
-              <w:pStyle w:val="Compact"/>
-            </w:pPr>
-            <w:r>
-              <w:t xml:space="preserve">0.294</w:t>
-            </w:r>
-          </w:p>
-        </w:tc>
-        <w:tc>
-          <w:tcPr/>
-          <w:p>
-            <w:pPr>
-              <w:pStyle w:val="Compact"/>
-            </w:pPr>
-            <w:r>
-              <w:t xml:space="preserve">-0.122</w:t>
+              <w:t xml:space="preserve">0.379</w:t>
+            </w:r>
+          </w:p>
+        </w:tc>
+        <w:tc>
+          <w:tcPr/>
+          <w:p>
+            <w:pPr>
+              <w:pStyle w:val="Compact"/>
+            </w:pPr>
+            <w:r>
+              <w:t xml:space="preserve">0.258</w:t>
+            </w:r>
+          </w:p>
+        </w:tc>
+        <w:tc>
+          <w:tcPr/>
+          <w:p>
+            <w:pPr>
+              <w:pStyle w:val="Compact"/>
+            </w:pPr>
+            <w:r>
+              <w:t xml:space="preserve">0.135</w:t>
+            </w:r>
+          </w:p>
+        </w:tc>
+        <w:tc>
+          <w:tcPr/>
+          <w:p>
+            <w:pPr>
+              <w:pStyle w:val="Compact"/>
+            </w:pPr>
+            <w:r>
+              <w:t xml:space="preserve">0.086</w:t>
+            </w:r>
+          </w:p>
+        </w:tc>
+        <w:tc>
+          <w:tcPr/>
+          <w:p>
+            <w:pPr>
+              <w:pStyle w:val="Compact"/>
+            </w:pPr>
+            <w:r>
+              <w:t xml:space="preserve">0.133</w:t>
+            </w:r>
+          </w:p>
+        </w:tc>
+        <w:tc>
+          <w:tcPr/>
+          <w:p>
+            <w:pPr>
+              <w:pStyle w:val="Compact"/>
+            </w:pPr>
+            <w:r>
+              <w:t xml:space="preserve">-0.233</w:t>
             </w:r>
           </w:p>
         </w:tc>
@@ -347,62 +347,62 @@
               <w:pStyle w:val="Compact"/>
             </w:pPr>
             <w:r>
-              <w:t xml:space="preserve">1.389 (0.984)</w:t>
-            </w:r>
-          </w:p>
-        </w:tc>
-        <w:tc>
-          <w:tcPr/>
-          <w:p>
-            <w:pPr>
-              <w:pStyle w:val="Compact"/>
-            </w:pPr>
-            <w:r>
-              <w:t xml:space="preserve">0.588 (0.252)</w:t>
-            </w:r>
-          </w:p>
-        </w:tc>
-        <w:tc>
-          <w:tcPr/>
-          <w:p>
-            <w:pPr>
-              <w:pStyle w:val="Compact"/>
-            </w:pPr>
-            <w:r>
-              <w:t xml:space="preserve">0.353 (0.238)</w:t>
-            </w:r>
-          </w:p>
-        </w:tc>
-        <w:tc>
-          <w:tcPr/>
-          <w:p>
-            <w:pPr>
-              <w:pStyle w:val="Compact"/>
-            </w:pPr>
-            <w:r>
-              <w:t xml:space="preserve">0.275 (0.252)</w:t>
-            </w:r>
-          </w:p>
-        </w:tc>
-        <w:tc>
-          <w:tcPr/>
-          <w:p>
-            <w:pPr>
-              <w:pStyle w:val="Compact"/>
-            </w:pPr>
-            <w:r>
-              <w:t xml:space="preserve">0.294 (0.249)</w:t>
-            </w:r>
-          </w:p>
-        </w:tc>
-        <w:tc>
-          <w:tcPr/>
-          <w:p>
-            <w:pPr>
-              <w:pStyle w:val="Compact"/>
-            </w:pPr>
-            <w:r>
-              <w:t xml:space="preserve">-0.122 (0.246)</w:t>
+              <w:t xml:space="preserve">0.379 (1.285)</w:t>
+            </w:r>
+          </w:p>
+        </w:tc>
+        <w:tc>
+          <w:tcPr/>
+          <w:p>
+            <w:pPr>
+              <w:pStyle w:val="Compact"/>
+            </w:pPr>
+            <w:r>
+              <w:t xml:space="preserve">0.258 (0.309)</w:t>
+            </w:r>
+          </w:p>
+        </w:tc>
+        <w:tc>
+          <w:tcPr/>
+          <w:p>
+            <w:pPr>
+              <w:pStyle w:val="Compact"/>
+            </w:pPr>
+            <w:r>
+              <w:t xml:space="preserve">0.135 (0.309)</w:t>
+            </w:r>
+          </w:p>
+        </w:tc>
+        <w:tc>
+          <w:tcPr/>
+          <w:p>
+            <w:pPr>
+              <w:pStyle w:val="Compact"/>
+            </w:pPr>
+            <w:r>
+              <w:t xml:space="preserve">0.086 (0.316)</w:t>
+            </w:r>
+          </w:p>
+        </w:tc>
+        <w:tc>
+          <w:tcPr/>
+          <w:p>
+            <w:pPr>
+              <w:pStyle w:val="Compact"/>
+            </w:pPr>
+            <w:r>
+              <w:t xml:space="preserve">0.133 (0.308)</w:t>
+            </w:r>
+          </w:p>
+        </w:tc>
+        <w:tc>
+          <w:tcPr/>
+          <w:p>
+            <w:pPr>
+              <w:pStyle w:val="Compact"/>
+            </w:pPr>
+            <w:r>
+              <w:t xml:space="preserve">-0.233 (0.304)</w:t>
             </w:r>
           </w:p>
         </w:tc>
@@ -426,62 +426,62 @@
               <w:pStyle w:val="Compact"/>
             </w:pPr>
             <w:r>
-              <w:t xml:space="preserve">-0.168</w:t>
-            </w:r>
-          </w:p>
-        </w:tc>
-        <w:tc>
-          <w:tcPr/>
-          <w:p>
-            <w:pPr>
-              <w:pStyle w:val="Compact"/>
-            </w:pPr>
-            <w:r>
-              <w:t xml:space="preserve">-0.507</w:t>
-            </w:r>
-          </w:p>
-        </w:tc>
-        <w:tc>
-          <w:tcPr/>
-          <w:p>
-            <w:pPr>
-              <w:pStyle w:val="Compact"/>
-            </w:pPr>
-            <w:r>
-              <w:t xml:space="preserve">-0.032</w:t>
-            </w:r>
-          </w:p>
-        </w:tc>
-        <w:tc>
-          <w:tcPr/>
-          <w:p>
-            <w:pPr>
-              <w:pStyle w:val="Compact"/>
-            </w:pPr>
-            <w:r>
-              <w:t xml:space="preserve">-0.049</w:t>
-            </w:r>
-          </w:p>
-        </w:tc>
-        <w:tc>
-          <w:tcPr/>
-          <w:p>
-            <w:pPr>
-              <w:pStyle w:val="Compact"/>
-            </w:pPr>
-            <w:r>
-              <w:t xml:space="preserve">0.165</w:t>
-            </w:r>
-          </w:p>
-        </w:tc>
-        <w:tc>
-          <w:tcPr/>
-          <w:p>
-            <w:pPr>
-              <w:pStyle w:val="Compact"/>
-            </w:pPr>
-            <w:r>
-              <w:t xml:space="preserve">0.254</w:t>
+              <w:t xml:space="preserve">1.573</w:t>
+            </w:r>
+          </w:p>
+        </w:tc>
+        <w:tc>
+          <w:tcPr/>
+          <w:p>
+            <w:pPr>
+              <w:pStyle w:val="Compact"/>
+            </w:pPr>
+            <w:r>
+              <w:t xml:space="preserve">-0.045</w:t>
+            </w:r>
+          </w:p>
+        </w:tc>
+        <w:tc>
+          <w:tcPr/>
+          <w:p>
+            <w:pPr>
+              <w:pStyle w:val="Compact"/>
+            </w:pPr>
+            <w:r>
+              <w:t xml:space="preserve">0.518</w:t>
+            </w:r>
+          </w:p>
+        </w:tc>
+        <w:tc>
+          <w:tcPr/>
+          <w:p>
+            <w:pPr>
+              <w:pStyle w:val="Compact"/>
+            </w:pPr>
+            <w:r>
+              <w:t xml:space="preserve">-0.113</w:t>
+            </w:r>
+          </w:p>
+        </w:tc>
+        <w:tc>
+          <w:tcPr/>
+          <w:p>
+            <w:pPr>
+              <w:pStyle w:val="Compact"/>
+            </w:pPr>
+            <w:r>
+              <w:t xml:space="preserve">0.281</w:t>
+            </w:r>
+          </w:p>
+        </w:tc>
+        <w:tc>
+          <w:tcPr/>
+          <w:p>
+            <w:pPr>
+              <w:pStyle w:val="Compact"/>
+            </w:pPr>
+            <w:r>
+              <w:t xml:space="preserve">0.931*</w:t>
             </w:r>
           </w:p>
         </w:tc>
@@ -502,62 +502,62 @@
               <w:pStyle w:val="Compact"/>
             </w:pPr>
             <w:r>
-              <w:t xml:space="preserve">-0.168 (1.531)</w:t>
-            </w:r>
-          </w:p>
-        </w:tc>
-        <w:tc>
-          <w:tcPr/>
-          <w:p>
-            <w:pPr>
-              <w:pStyle w:val="Compact"/>
-            </w:pPr>
-            <w:r>
-              <w:t xml:space="preserve">-0.507 (0.392)</w:t>
-            </w:r>
-          </w:p>
-        </w:tc>
-        <w:tc>
-          <w:tcPr/>
-          <w:p>
-            <w:pPr>
-              <w:pStyle w:val="Compact"/>
-            </w:pPr>
-            <w:r>
-              <w:t xml:space="preserve">-0.032 (0.371)</w:t>
-            </w:r>
-          </w:p>
-        </w:tc>
-        <w:tc>
-          <w:tcPr/>
-          <w:p>
-            <w:pPr>
-              <w:pStyle w:val="Compact"/>
-            </w:pPr>
-            <w:r>
-              <w:t xml:space="preserve">-0.049 (0.392)</w:t>
-            </w:r>
-          </w:p>
-        </w:tc>
-        <w:tc>
-          <w:tcPr/>
-          <w:p>
-            <w:pPr>
-              <w:pStyle w:val="Compact"/>
-            </w:pPr>
-            <w:r>
-              <w:t xml:space="preserve">0.165 (0.387)</w:t>
-            </w:r>
-          </w:p>
-        </w:tc>
-        <w:tc>
-          <w:tcPr/>
-          <w:p>
-            <w:pPr>
-              <w:pStyle w:val="Compact"/>
-            </w:pPr>
-            <w:r>
-              <w:t xml:space="preserve">0.254 (0.382)</w:t>
+              <w:t xml:space="preserve">1.573 (1.770)</w:t>
+            </w:r>
+          </w:p>
+        </w:tc>
+        <w:tc>
+          <w:tcPr/>
+          <w:p>
+            <w:pPr>
+              <w:pStyle w:val="Compact"/>
+            </w:pPr>
+            <w:r>
+              <w:t xml:space="preserve">-0.045 (0.460)</w:t>
+            </w:r>
+          </w:p>
+        </w:tc>
+        <w:tc>
+          <w:tcPr/>
+          <w:p>
+            <w:pPr>
+              <w:pStyle w:val="Compact"/>
+            </w:pPr>
+            <w:r>
+              <w:t xml:space="preserve">0.518 (0.385)</w:t>
+            </w:r>
+          </w:p>
+        </w:tc>
+        <w:tc>
+          <w:tcPr/>
+          <w:p>
+            <w:pPr>
+              <w:pStyle w:val="Compact"/>
+            </w:pPr>
+            <w:r>
+              <w:t xml:space="preserve">-0.113 (0.439)</w:t>
+            </w:r>
+          </w:p>
+        </w:tc>
+        <w:tc>
+          <w:tcPr/>
+          <w:p>
+            <w:pPr>
+              <w:pStyle w:val="Compact"/>
+            </w:pPr>
+            <w:r>
+              <w:t xml:space="preserve">0.281 (0.504)</w:t>
+            </w:r>
+          </w:p>
+        </w:tc>
+        <w:tc>
+          <w:tcPr/>
+          <w:p>
+            <w:pPr>
+              <w:pStyle w:val="Compact"/>
+            </w:pPr>
+            <w:r>
+              <w:t xml:space="preserve">0.931 (0.446)</w:t>
             </w:r>
           </w:p>
         </w:tc>
@@ -570,73 +570,73 @@
               <w:pStyle w:val="Compact"/>
             </w:pPr>
             <w:r>
-              <w:t xml:space="preserve">Flooding × VotedLokSabha2019MGB</w:t>
-            </w:r>
-          </w:p>
-        </w:tc>
-        <w:tc>
-          <w:tcPr/>
-          <w:p>
-            <w:pPr>
-              <w:pStyle w:val="Compact"/>
-            </w:pPr>
-            <w:r>
-              <w:t xml:space="preserve">-1.371</w:t>
-            </w:r>
-          </w:p>
-        </w:tc>
-        <w:tc>
-          <w:tcPr/>
-          <w:p>
-            <w:pPr>
-              <w:pStyle w:val="Compact"/>
-            </w:pPr>
-            <w:r>
-              <w:t xml:space="preserve">-0.032</w:t>
-            </w:r>
-          </w:p>
-        </w:tc>
-        <w:tc>
-          <w:tcPr/>
-          <w:p>
-            <w:pPr>
-              <w:pStyle w:val="Compact"/>
-            </w:pPr>
-            <w:r>
-              <w:t xml:space="preserve">-0.346</w:t>
-            </w:r>
-          </w:p>
-        </w:tc>
-        <w:tc>
-          <w:tcPr/>
-          <w:p>
-            <w:pPr>
-              <w:pStyle w:val="Compact"/>
-            </w:pPr>
-            <w:r>
-              <w:t xml:space="preserve">-0.262</w:t>
-            </w:r>
-          </w:p>
-        </w:tc>
-        <w:tc>
-          <w:tcPr/>
-          <w:p>
-            <w:pPr>
-              <w:pStyle w:val="Compact"/>
-            </w:pPr>
-            <w:r>
-              <w:t xml:space="preserve">-0.733</w:t>
-            </w:r>
-          </w:p>
-        </w:tc>
-        <w:tc>
-          <w:tcPr/>
-          <w:p>
-            <w:pPr>
-              <w:pStyle w:val="Compact"/>
-            </w:pPr>
-            <w:r>
-              <w:t xml:space="preserve">0.001</w:t>
+              <w:t xml:space="preserve">patna</w:t>
+            </w:r>
+          </w:p>
+        </w:tc>
+        <w:tc>
+          <w:tcPr/>
+          <w:p>
+            <w:pPr>
+              <w:pStyle w:val="Compact"/>
+            </w:pPr>
+            <w:r>
+              <w:t xml:space="preserve">-2.417+</w:t>
+            </w:r>
+          </w:p>
+        </w:tc>
+        <w:tc>
+          <w:tcPr/>
+          <w:p>
+            <w:pPr>
+              <w:pStyle w:val="Compact"/>
+            </w:pPr>
+            <w:r>
+              <w:t xml:space="preserve">-0.839**</w:t>
+            </w:r>
+          </w:p>
+        </w:tc>
+        <w:tc>
+          <w:tcPr/>
+          <w:p>
+            <w:pPr>
+              <w:pStyle w:val="Compact"/>
+            </w:pPr>
+            <w:r>
+              <w:t xml:space="preserve">-0.590*</w:t>
+            </w:r>
+          </w:p>
+        </w:tc>
+        <w:tc>
+          <w:tcPr/>
+          <w:p>
+            <w:pPr>
+              <w:pStyle w:val="Compact"/>
+            </w:pPr>
+            <w:r>
+              <w:t xml:space="preserve">-0.231</w:t>
+            </w:r>
+          </w:p>
+        </w:tc>
+        <w:tc>
+          <w:tcPr/>
+          <w:p>
+            <w:pPr>
+              <w:pStyle w:val="Compact"/>
+            </w:pPr>
+            <w:r>
+              <w:t xml:space="preserve">-0.304</w:t>
+            </w:r>
+          </w:p>
+        </w:tc>
+        <w:tc>
+          <w:tcPr/>
+          <w:p>
+            <w:pPr>
+              <w:pStyle w:val="Compact"/>
+            </w:pPr>
+            <w:r>
+              <w:t xml:space="preserve">-0.454</w:t>
             </w:r>
           </w:p>
         </w:tc>
@@ -657,62 +657,62 @@
               <w:pStyle w:val="Compact"/>
             </w:pPr>
             <w:r>
-              <w:t xml:space="preserve">-1.371 (2.099)</w:t>
-            </w:r>
-          </w:p>
-        </w:tc>
-        <w:tc>
-          <w:tcPr/>
-          <w:p>
-            <w:pPr>
-              <w:pStyle w:val="Compact"/>
-            </w:pPr>
-            <w:r>
-              <w:t xml:space="preserve">-0.032 (0.538)</w:t>
-            </w:r>
-          </w:p>
-        </w:tc>
-        <w:tc>
-          <w:tcPr/>
-          <w:p>
-            <w:pPr>
-              <w:pStyle w:val="Compact"/>
-            </w:pPr>
-            <w:r>
-              <w:t xml:space="preserve">-0.346 (0.509)</w:t>
-            </w:r>
-          </w:p>
-        </w:tc>
-        <w:tc>
-          <w:tcPr/>
-          <w:p>
-            <w:pPr>
-              <w:pStyle w:val="Compact"/>
-            </w:pPr>
-            <w:r>
-              <w:t xml:space="preserve">-0.262 (0.538)</w:t>
-            </w:r>
-          </w:p>
-        </w:tc>
-        <w:tc>
-          <w:tcPr/>
-          <w:p>
-            <w:pPr>
-              <w:pStyle w:val="Compact"/>
-            </w:pPr>
-            <w:r>
-              <w:t xml:space="preserve">-0.733 (0.530)</w:t>
-            </w:r>
-          </w:p>
-        </w:tc>
-        <w:tc>
-          <w:tcPr/>
-          <w:p>
-            <w:pPr>
-              <w:pStyle w:val="Compact"/>
-            </w:pPr>
-            <w:r>
-              <w:t xml:space="preserve">0.001 (0.524)</w:t>
+              <w:t xml:space="preserve">-2.417 (1.286)</w:t>
+            </w:r>
+          </w:p>
+        </w:tc>
+        <w:tc>
+          <w:tcPr/>
+          <w:p>
+            <w:pPr>
+              <w:pStyle w:val="Compact"/>
+            </w:pPr>
+            <w:r>
+              <w:t xml:space="preserve">-0.839 (0.313)</w:t>
+            </w:r>
+          </w:p>
+        </w:tc>
+        <w:tc>
+          <w:tcPr/>
+          <w:p>
+            <w:pPr>
+              <w:pStyle w:val="Compact"/>
+            </w:pPr>
+            <w:r>
+              <w:t xml:space="preserve">-0.590 (0.287)</w:t>
+            </w:r>
+          </w:p>
+        </w:tc>
+        <w:tc>
+          <w:tcPr/>
+          <w:p>
+            <w:pPr>
+              <w:pStyle w:val="Compact"/>
+            </w:pPr>
+            <w:r>
+              <w:t xml:space="preserve">-0.231 (0.316)</w:t>
+            </w:r>
+          </w:p>
+        </w:tc>
+        <w:tc>
+          <w:tcPr/>
+          <w:p>
+            <w:pPr>
+              <w:pStyle w:val="Compact"/>
+            </w:pPr>
+            <w:r>
+              <w:t xml:space="preserve">-0.304 (0.321)</w:t>
+            </w:r>
+          </w:p>
+        </w:tc>
+        <w:tc>
+          <w:tcPr/>
+          <w:p>
+            <w:pPr>
+              <w:pStyle w:val="Compact"/>
+            </w:pPr>
+            <w:r>
+              <w:t xml:space="preserve">-0.454 (0.303)</w:t>
             </w:r>
           </w:p>
         </w:tc>
@@ -725,73 +725,73 @@
               <w:pStyle w:val="Compact"/>
             </w:pPr>
             <w:r>
-              <w:t xml:space="preserve">Num.Obs.</w:t>
-            </w:r>
-          </w:p>
-        </w:tc>
-        <w:tc>
-          <w:tcPr/>
-          <w:p>
-            <w:pPr>
-              <w:pStyle w:val="Compact"/>
-            </w:pPr>
-            <w:r>
-              <w:t xml:space="preserve">317</w:t>
-            </w:r>
-          </w:p>
-        </w:tc>
-        <w:tc>
-          <w:tcPr/>
-          <w:p>
-            <w:pPr>
-              <w:pStyle w:val="Compact"/>
-            </w:pPr>
-            <w:r>
-              <w:t xml:space="preserve">317</w:t>
-            </w:r>
-          </w:p>
-        </w:tc>
-        <w:tc>
-          <w:tcPr/>
-          <w:p>
-            <w:pPr>
-              <w:pStyle w:val="Compact"/>
-            </w:pPr>
-            <w:r>
-              <w:t xml:space="preserve">317</w:t>
-            </w:r>
-          </w:p>
-        </w:tc>
-        <w:tc>
-          <w:tcPr/>
-          <w:p>
-            <w:pPr>
-              <w:pStyle w:val="Compact"/>
-            </w:pPr>
-            <w:r>
-              <w:t xml:space="preserve">317</w:t>
-            </w:r>
-          </w:p>
-        </w:tc>
-        <w:tc>
-          <w:tcPr/>
-          <w:p>
-            <w:pPr>
-              <w:pStyle w:val="Compact"/>
-            </w:pPr>
-            <w:r>
-              <w:t xml:space="preserve">317</w:t>
-            </w:r>
-          </w:p>
-        </w:tc>
-        <w:tc>
-          <w:tcPr/>
-          <w:p>
-            <w:pPr>
-              <w:pStyle w:val="Compact"/>
-            </w:pPr>
-            <w:r>
-              <w:t xml:space="preserve">317</w:t>
+              <w:t xml:space="preserve">Flooding × VotedLokSabha2019MGB</w:t>
+            </w:r>
+          </w:p>
+        </w:tc>
+        <w:tc>
+          <w:tcPr/>
+          <w:p>
+            <w:pPr>
+              <w:pStyle w:val="Compact"/>
+            </w:pPr>
+            <w:r>
+              <w:t xml:space="preserve">-3.113</w:t>
+            </w:r>
+          </w:p>
+        </w:tc>
+        <w:tc>
+          <w:tcPr/>
+          <w:p>
+            <w:pPr>
+              <w:pStyle w:val="Compact"/>
+            </w:pPr>
+            <w:r>
+              <w:t xml:space="preserve">-0.494</w:t>
+            </w:r>
+          </w:p>
+        </w:tc>
+        <w:tc>
+          <w:tcPr/>
+          <w:p>
+            <w:pPr>
+              <w:pStyle w:val="Compact"/>
+            </w:pPr>
+            <w:r>
+              <w:t xml:space="preserve">-0.897+</w:t>
+            </w:r>
+          </w:p>
+        </w:tc>
+        <w:tc>
+          <w:tcPr/>
+          <w:p>
+            <w:pPr>
+              <w:pStyle w:val="Compact"/>
+            </w:pPr>
+            <w:r>
+              <w:t xml:space="preserve">-0.198</w:t>
+            </w:r>
+          </w:p>
+        </w:tc>
+        <w:tc>
+          <w:tcPr/>
+          <w:p>
+            <w:pPr>
+              <w:pStyle w:val="Compact"/>
+            </w:pPr>
+            <w:r>
+              <w:t xml:space="preserve">-0.849</w:t>
+            </w:r>
+          </w:p>
+        </w:tc>
+        <w:tc>
+          <w:tcPr/>
+          <w:p>
+            <w:pPr>
+              <w:pStyle w:val="Compact"/>
+            </w:pPr>
+            <w:r>
+              <w:t xml:space="preserve">-0.676</w:t>
             </w:r>
           </w:p>
         </w:tc>
@@ -803,74 +803,71 @@
             <w:pPr>
               <w:pStyle w:val="Compact"/>
             </w:pPr>
-            <w:r>
-              <w:t xml:space="preserve">R2</w:t>
-            </w:r>
-          </w:p>
-        </w:tc>
-        <w:tc>
-          <w:tcPr/>
-          <w:p>
-            <w:pPr>
-              <w:pStyle w:val="Compact"/>
-            </w:pPr>
-            <w:r>
-              <w:t xml:space="preserve">0.008</w:t>
-            </w:r>
-          </w:p>
-        </w:tc>
-        <w:tc>
-          <w:tcPr/>
-          <w:p>
-            <w:pPr>
-              <w:pStyle w:val="Compact"/>
-            </w:pPr>
-            <w:r>
-              <w:t xml:space="preserve">0.032</w:t>
-            </w:r>
-          </w:p>
-        </w:tc>
-        <w:tc>
-          <w:tcPr/>
-          <w:p>
-            <w:pPr>
-              <w:pStyle w:val="Compact"/>
-            </w:pPr>
-            <w:r>
-              <w:t xml:space="preserve">0.009</w:t>
-            </w:r>
-          </w:p>
-        </w:tc>
-        <w:tc>
-          <w:tcPr/>
-          <w:p>
-            <w:pPr>
-              <w:pStyle w:val="Compact"/>
-            </w:pPr>
-            <w:r>
-              <w:t xml:space="preserve">0.005</w:t>
-            </w:r>
-          </w:p>
-        </w:tc>
-        <w:tc>
-          <w:tcPr/>
-          <w:p>
-            <w:pPr>
-              <w:pStyle w:val="Compact"/>
-            </w:pPr>
-            <w:r>
-              <w:t xml:space="preserve">0.009</w:t>
-            </w:r>
-          </w:p>
-        </w:tc>
-        <w:tc>
-          <w:tcPr/>
-          <w:p>
-            <w:pPr>
-              <w:pStyle w:val="Compact"/>
-            </w:pPr>
-            <w:r>
-              <w:t xml:space="preserve">0.004</w:t>
+          </w:p>
+        </w:tc>
+        <w:tc>
+          <w:tcPr/>
+          <w:p>
+            <w:pPr>
+              <w:pStyle w:val="Compact"/>
+            </w:pPr>
+            <w:r>
+              <w:t xml:space="preserve">-3.113 (2.438)</w:t>
+            </w:r>
+          </w:p>
+        </w:tc>
+        <w:tc>
+          <w:tcPr/>
+          <w:p>
+            <w:pPr>
+              <w:pStyle w:val="Compact"/>
+            </w:pPr>
+            <w:r>
+              <w:t xml:space="preserve">-0.494 (0.614)</w:t>
+            </w:r>
+          </w:p>
+        </w:tc>
+        <w:tc>
+          <w:tcPr/>
+          <w:p>
+            <w:pPr>
+              <w:pStyle w:val="Compact"/>
+            </w:pPr>
+            <w:r>
+              <w:t xml:space="preserve">-0.897 (0.537)</w:t>
+            </w:r>
+          </w:p>
+        </w:tc>
+        <w:tc>
+          <w:tcPr/>
+          <w:p>
+            <w:pPr>
+              <w:pStyle w:val="Compact"/>
+            </w:pPr>
+            <w:r>
+              <w:t xml:space="preserve">-0.198 (0.588)</w:t>
+            </w:r>
+          </w:p>
+        </w:tc>
+        <w:tc>
+          <w:tcPr/>
+          <w:p>
+            <w:pPr>
+              <w:pStyle w:val="Compact"/>
+            </w:pPr>
+            <w:r>
+              <w:t xml:space="preserve">-0.849 (0.657)</w:t>
+            </w:r>
+          </w:p>
+        </w:tc>
+        <w:tc>
+          <w:tcPr/>
+          <w:p>
+            <w:pPr>
+              <w:pStyle w:val="Compact"/>
+            </w:pPr>
+            <w:r>
+              <w:t xml:space="preserve">-0.676 (0.616)</w:t>
             </w:r>
           </w:p>
         </w:tc>
@@ -883,73 +880,73 @@
               <w:pStyle w:val="Compact"/>
             </w:pPr>
             <w:r>
-              <w:t xml:space="preserve">R2 Adj.</w:t>
-            </w:r>
-          </w:p>
-        </w:tc>
-        <w:tc>
-          <w:tcPr/>
-          <w:p>
-            <w:pPr>
-              <w:pStyle w:val="Compact"/>
-            </w:pPr>
-            <w:r>
-              <w:t xml:space="preserve">-0.001</w:t>
-            </w:r>
-          </w:p>
-        </w:tc>
-        <w:tc>
-          <w:tcPr/>
-          <w:p>
-            <w:pPr>
-              <w:pStyle w:val="Compact"/>
-            </w:pPr>
-            <w:r>
-              <w:t xml:space="preserve">0.022</w:t>
-            </w:r>
-          </w:p>
-        </w:tc>
-        <w:tc>
-          <w:tcPr/>
-          <w:p>
-            <w:pPr>
-              <w:pStyle w:val="Compact"/>
-            </w:pPr>
-            <w:r>
-              <w:t xml:space="preserve">-0.001</w:t>
-            </w:r>
-          </w:p>
-        </w:tc>
-        <w:tc>
-          <w:tcPr/>
-          <w:p>
-            <w:pPr>
-              <w:pStyle w:val="Compact"/>
-            </w:pPr>
-            <w:r>
-              <w:t xml:space="preserve">-0.004</w:t>
-            </w:r>
-          </w:p>
-        </w:tc>
-        <w:tc>
-          <w:tcPr/>
-          <w:p>
-            <w:pPr>
-              <w:pStyle w:val="Compact"/>
-            </w:pPr>
-            <w:r>
-              <w:t xml:space="preserve">-0.000</w:t>
-            </w:r>
-          </w:p>
-        </w:tc>
-        <w:tc>
-          <w:tcPr/>
-          <w:p>
-            <w:pPr>
-              <w:pStyle w:val="Compact"/>
-            </w:pPr>
-            <w:r>
-              <w:t xml:space="preserve">-0.006</w:t>
+              <w:t xml:space="preserve">Num.Obs.</w:t>
+            </w:r>
+          </w:p>
+        </w:tc>
+        <w:tc>
+          <w:tcPr/>
+          <w:p>
+            <w:pPr>
+              <w:pStyle w:val="Compact"/>
+            </w:pPr>
+            <w:r>
+              <w:t xml:space="preserve">312</w:t>
+            </w:r>
+          </w:p>
+        </w:tc>
+        <w:tc>
+          <w:tcPr/>
+          <w:p>
+            <w:pPr>
+              <w:pStyle w:val="Compact"/>
+            </w:pPr>
+            <w:r>
+              <w:t xml:space="preserve">312</w:t>
+            </w:r>
+          </w:p>
+        </w:tc>
+        <w:tc>
+          <w:tcPr/>
+          <w:p>
+            <w:pPr>
+              <w:pStyle w:val="Compact"/>
+            </w:pPr>
+            <w:r>
+              <w:t xml:space="preserve">312</w:t>
+            </w:r>
+          </w:p>
+        </w:tc>
+        <w:tc>
+          <w:tcPr/>
+          <w:p>
+            <w:pPr>
+              <w:pStyle w:val="Compact"/>
+            </w:pPr>
+            <w:r>
+              <w:t xml:space="preserve">312</w:t>
+            </w:r>
+          </w:p>
+        </w:tc>
+        <w:tc>
+          <w:tcPr/>
+          <w:p>
+            <w:pPr>
+              <w:pStyle w:val="Compact"/>
+            </w:pPr>
+            <w:r>
+              <w:t xml:space="preserve">312</w:t>
+            </w:r>
+          </w:p>
+        </w:tc>
+        <w:tc>
+          <w:tcPr/>
+          <w:p>
+            <w:pPr>
+              <w:pStyle w:val="Compact"/>
+            </w:pPr>
+            <w:r>
+              <w:t xml:space="preserve">312</w:t>
             </w:r>
           </w:p>
         </w:tc>
@@ -962,73 +959,73 @@
               <w:pStyle w:val="Compact"/>
             </w:pPr>
             <w:r>
-              <w:t xml:space="preserve">AIC</w:t>
-            </w:r>
-          </w:p>
-        </w:tc>
-        <w:tc>
-          <w:tcPr/>
-          <w:p>
-            <w:pPr>
-              <w:pStyle w:val="Compact"/>
-            </w:pPr>
-            <w:r>
-              <w:t xml:space="preserve">2202.0</w:t>
-            </w:r>
-          </w:p>
-        </w:tc>
-        <w:tc>
-          <w:tcPr/>
-          <w:p>
-            <w:pPr>
-              <w:pStyle w:val="Compact"/>
-            </w:pPr>
-            <w:r>
-              <w:t xml:space="preserve">1338.5</w:t>
-            </w:r>
-          </w:p>
-        </w:tc>
-        <w:tc>
-          <w:tcPr/>
-          <w:p>
-            <w:pPr>
-              <w:pStyle w:val="Compact"/>
-            </w:pPr>
-            <w:r>
-              <w:t xml:space="preserve">1303.6</w:t>
-            </w:r>
-          </w:p>
-        </w:tc>
-        <w:tc>
-          <w:tcPr/>
-          <w:p>
-            <w:pPr>
-              <w:pStyle w:val="Compact"/>
-            </w:pPr>
-            <w:r>
-              <w:t xml:space="preserve">1338.9</w:t>
-            </w:r>
-          </w:p>
-        </w:tc>
-        <w:tc>
-          <w:tcPr/>
-          <w:p>
-            <w:pPr>
-              <w:pStyle w:val="Compact"/>
-            </w:pPr>
-            <w:r>
-              <w:t xml:space="preserve">1329.9</w:t>
-            </w:r>
-          </w:p>
-        </w:tc>
-        <w:tc>
-          <w:tcPr/>
-          <w:p>
-            <w:pPr>
-              <w:pStyle w:val="Compact"/>
-            </w:pPr>
-            <w:r>
-              <w:t xml:space="preserve">1322.3</w:t>
+              <w:t xml:space="preserve">R2</w:t>
+            </w:r>
+          </w:p>
+        </w:tc>
+        <w:tc>
+          <w:tcPr/>
+          <w:p>
+            <w:pPr>
+              <w:pStyle w:val="Compact"/>
+            </w:pPr>
+            <w:r>
+              <w:t xml:space="preserve">0.023</w:t>
+            </w:r>
+          </w:p>
+        </w:tc>
+        <w:tc>
+          <w:tcPr/>
+          <w:p>
+            <w:pPr>
+              <w:pStyle w:val="Compact"/>
+            </w:pPr>
+            <w:r>
+              <w:t xml:space="preserve">0.052</w:t>
+            </w:r>
+          </w:p>
+        </w:tc>
+        <w:tc>
+          <w:tcPr/>
+          <w:p>
+            <w:pPr>
+              <w:pStyle w:val="Compact"/>
+            </w:pPr>
+            <w:r>
+              <w:t xml:space="preserve">0.027</w:t>
+            </w:r>
+          </w:p>
+        </w:tc>
+        <w:tc>
+          <w:tcPr/>
+          <w:p>
+            <w:pPr>
+              <w:pStyle w:val="Compact"/>
+            </w:pPr>
+            <w:r>
+              <w:t xml:space="preserve">0.006</w:t>
+            </w:r>
+          </w:p>
+        </w:tc>
+        <w:tc>
+          <w:tcPr/>
+          <w:p>
+            <w:pPr>
+              <w:pStyle w:val="Compact"/>
+            </w:pPr>
+            <w:r>
+              <w:t xml:space="preserve">0.013</w:t>
+            </w:r>
+          </w:p>
+        </w:tc>
+        <w:tc>
+          <w:tcPr/>
+          <w:p>
+            <w:pPr>
+              <w:pStyle w:val="Compact"/>
+            </w:pPr>
+            <w:r>
+              <w:t xml:space="preserve">0.023</w:t>
             </w:r>
           </w:p>
         </w:tc>
@@ -1041,73 +1038,73 @@
               <w:pStyle w:val="Compact"/>
             </w:pPr>
             <w:r>
-              <w:t xml:space="preserve">BIC</w:t>
-            </w:r>
-          </w:p>
-        </w:tc>
-        <w:tc>
-          <w:tcPr/>
-          <w:p>
-            <w:pPr>
-              <w:pStyle w:val="Compact"/>
-            </w:pPr>
-            <w:r>
-              <w:t xml:space="preserve">2220.8</w:t>
-            </w:r>
-          </w:p>
-        </w:tc>
-        <w:tc>
-          <w:tcPr/>
-          <w:p>
-            <w:pPr>
-              <w:pStyle w:val="Compact"/>
-            </w:pPr>
-            <w:r>
-              <w:t xml:space="preserve">1357.3</w:t>
-            </w:r>
-          </w:p>
-        </w:tc>
-        <w:tc>
-          <w:tcPr/>
-          <w:p>
-            <w:pPr>
-              <w:pStyle w:val="Compact"/>
-            </w:pPr>
-            <w:r>
-              <w:t xml:space="preserve">1322.4</w:t>
-            </w:r>
-          </w:p>
-        </w:tc>
-        <w:tc>
-          <w:tcPr/>
-          <w:p>
-            <w:pPr>
-              <w:pStyle w:val="Compact"/>
-            </w:pPr>
-            <w:r>
-              <w:t xml:space="preserve">1357.7</w:t>
-            </w:r>
-          </w:p>
-        </w:tc>
-        <w:tc>
-          <w:tcPr/>
-          <w:p>
-            <w:pPr>
-              <w:pStyle w:val="Compact"/>
-            </w:pPr>
-            <w:r>
-              <w:t xml:space="preserve">1348.7</w:t>
-            </w:r>
-          </w:p>
-        </w:tc>
-        <w:tc>
-          <w:tcPr/>
-          <w:p>
-            <w:pPr>
-              <w:pStyle w:val="Compact"/>
-            </w:pPr>
-            <w:r>
-              <w:t xml:space="preserve">1341.1</w:t>
+              <w:t xml:space="preserve">R2 Adj.</w:t>
+            </w:r>
+          </w:p>
+        </w:tc>
+        <w:tc>
+          <w:tcPr/>
+          <w:p>
+            <w:pPr>
+              <w:pStyle w:val="Compact"/>
+            </w:pPr>
+            <w:r>
+              <w:t xml:space="preserve">0.010</w:t>
+            </w:r>
+          </w:p>
+        </w:tc>
+        <w:tc>
+          <w:tcPr/>
+          <w:p>
+            <w:pPr>
+              <w:pStyle w:val="Compact"/>
+            </w:pPr>
+            <w:r>
+              <w:t xml:space="preserve">0.040</w:t>
+            </w:r>
+          </w:p>
+        </w:tc>
+        <w:tc>
+          <w:tcPr/>
+          <w:p>
+            <w:pPr>
+              <w:pStyle w:val="Compact"/>
+            </w:pPr>
+            <w:r>
+              <w:t xml:space="preserve">0.015</w:t>
+            </w:r>
+          </w:p>
+        </w:tc>
+        <w:tc>
+          <w:tcPr/>
+          <w:p>
+            <w:pPr>
+              <w:pStyle w:val="Compact"/>
+            </w:pPr>
+            <w:r>
+              <w:t xml:space="preserve">-0.007</w:t>
+            </w:r>
+          </w:p>
+        </w:tc>
+        <w:tc>
+          <w:tcPr/>
+          <w:p>
+            <w:pPr>
+              <w:pStyle w:val="Compact"/>
+            </w:pPr>
+            <w:r>
+              <w:t xml:space="preserve">-0.000</w:t>
+            </w:r>
+          </w:p>
+        </w:tc>
+        <w:tc>
+          <w:tcPr/>
+          <w:p>
+            <w:pPr>
+              <w:pStyle w:val="Compact"/>
+            </w:pPr>
+            <w:r>
+              <w:t xml:space="preserve">0.010</w:t>
             </w:r>
           </w:p>
         </w:tc>
@@ -1120,73 +1117,73 @@
               <w:pStyle w:val="Compact"/>
             </w:pPr>
             <w:r>
-              <w:t xml:space="preserve">Log.Lik.</w:t>
-            </w:r>
-          </w:p>
-        </w:tc>
-        <w:tc>
-          <w:tcPr/>
-          <w:p>
-            <w:pPr>
-              <w:pStyle w:val="Compact"/>
-            </w:pPr>
-            <w:r>
-              <w:t xml:space="preserve">-1096.019</w:t>
-            </w:r>
-          </w:p>
-        </w:tc>
-        <w:tc>
-          <w:tcPr/>
-          <w:p>
-            <w:pPr>
-              <w:pStyle w:val="Compact"/>
-            </w:pPr>
-            <w:r>
-              <w:t xml:space="preserve">-664.264</w:t>
-            </w:r>
-          </w:p>
-        </w:tc>
-        <w:tc>
-          <w:tcPr/>
-          <w:p>
-            <w:pPr>
-              <w:pStyle w:val="Compact"/>
-            </w:pPr>
-            <w:r>
-              <w:t xml:space="preserve">-646.815</w:t>
-            </w:r>
-          </w:p>
-        </w:tc>
-        <w:tc>
-          <w:tcPr/>
-          <w:p>
-            <w:pPr>
-              <w:pStyle w:val="Compact"/>
-            </w:pPr>
-            <w:r>
-              <w:t xml:space="preserve">-664.431</w:t>
-            </w:r>
-          </w:p>
-        </w:tc>
-        <w:tc>
-          <w:tcPr/>
-          <w:p>
-            <w:pPr>
-              <w:pStyle w:val="Compact"/>
-            </w:pPr>
-            <w:r>
-              <w:t xml:space="preserve">-659.931</w:t>
-            </w:r>
-          </w:p>
-        </w:tc>
-        <w:tc>
-          <w:tcPr/>
-          <w:p>
-            <w:pPr>
-              <w:pStyle w:val="Compact"/>
-            </w:pPr>
-            <w:r>
-              <w:t xml:space="preserve">-656.146</w:t>
+              <w:t xml:space="preserve">AIC</w:t>
+            </w:r>
+          </w:p>
+        </w:tc>
+        <w:tc>
+          <w:tcPr/>
+          <w:p>
+            <w:pPr>
+              <w:pStyle w:val="Compact"/>
+            </w:pPr>
+            <w:r>
+              <w:t xml:space="preserve">2172.1</w:t>
+            </w:r>
+          </w:p>
+        </w:tc>
+        <w:tc>
+          <w:tcPr/>
+          <w:p>
+            <w:pPr>
+              <w:pStyle w:val="Compact"/>
+            </w:pPr>
+            <w:r>
+              <w:t xml:space="preserve">1310.9</w:t>
+            </w:r>
+          </w:p>
+        </w:tc>
+        <w:tc>
+          <w:tcPr/>
+          <w:p>
+            <w:pPr>
+              <w:pStyle w:val="Compact"/>
+            </w:pPr>
+            <w:r>
+              <w:t xml:space="preserve">1274.0</w:t>
+            </w:r>
+          </w:p>
+        </w:tc>
+        <w:tc>
+          <w:tcPr/>
+          <w:p>
+            <w:pPr>
+              <w:pStyle w:val="Compact"/>
+            </w:pPr>
+            <w:r>
+              <w:t xml:space="preserve">1314.7</w:t>
+            </w:r>
+          </w:p>
+        </w:tc>
+        <w:tc>
+          <w:tcPr/>
+          <w:p>
+            <w:pPr>
+              <w:pStyle w:val="Compact"/>
+            </w:pPr>
+            <w:r>
+              <w:t xml:space="preserve">1320.0</w:t>
+            </w:r>
+          </w:p>
+        </w:tc>
+        <w:tc>
+          <w:tcPr/>
+          <w:p>
+            <w:pPr>
+              <w:pStyle w:val="Compact"/>
+            </w:pPr>
+            <w:r>
+              <w:t xml:space="preserve">1307.0</w:t>
             </w:r>
           </w:p>
         </w:tc>
@@ -1199,6 +1196,85 @@
               <w:pStyle w:val="Compact"/>
             </w:pPr>
             <w:r>
+              <w:t xml:space="preserve">BIC</w:t>
+            </w:r>
+          </w:p>
+        </w:tc>
+        <w:tc>
+          <w:tcPr/>
+          <w:p>
+            <w:pPr>
+              <w:pStyle w:val="Compact"/>
+            </w:pPr>
+            <w:r>
+              <w:t xml:space="preserve">2194.5</w:t>
+            </w:r>
+          </w:p>
+        </w:tc>
+        <w:tc>
+          <w:tcPr/>
+          <w:p>
+            <w:pPr>
+              <w:pStyle w:val="Compact"/>
+            </w:pPr>
+            <w:r>
+              <w:t xml:space="preserve">1333.4</w:t>
+            </w:r>
+          </w:p>
+        </w:tc>
+        <w:tc>
+          <w:tcPr/>
+          <w:p>
+            <w:pPr>
+              <w:pStyle w:val="Compact"/>
+            </w:pPr>
+            <w:r>
+              <w:t xml:space="preserve">1296.5</w:t>
+            </w:r>
+          </w:p>
+        </w:tc>
+        <w:tc>
+          <w:tcPr/>
+          <w:p>
+            <w:pPr>
+              <w:pStyle w:val="Compact"/>
+            </w:pPr>
+            <w:r>
+              <w:t xml:space="preserve">1337.1</w:t>
+            </w:r>
+          </w:p>
+        </w:tc>
+        <w:tc>
+          <w:tcPr/>
+          <w:p>
+            <w:pPr>
+              <w:pStyle w:val="Compact"/>
+            </w:pPr>
+            <w:r>
+              <w:t xml:space="preserve">1342.4</w:t>
+            </w:r>
+          </w:p>
+        </w:tc>
+        <w:tc>
+          <w:tcPr/>
+          <w:p>
+            <w:pPr>
+              <w:pStyle w:val="Compact"/>
+            </w:pPr>
+            <w:r>
+              <w:t xml:space="preserve">1329.4</w:t>
+            </w:r>
+          </w:p>
+        </w:tc>
+      </w:tr>
+      <w:tr>
+        <w:tc>
+          <w:tcPr/>
+          <w:p>
+            <w:pPr>
+              <w:pStyle w:val="Compact"/>
+            </w:pPr>
+            <w:r>
               <w:t xml:space="preserve">RMSE</w:t>
             </w:r>
           </w:p>
@@ -1210,7 +1286,40 @@
               <w:pStyle w:val="Compact"/>
             </w:pPr>
             <w:r>
-              <w:t xml:space="preserve">7.68</w:t>
+              <w:t xml:space="preserve">7.71</w:t>
+            </w:r>
+          </w:p>
+        </w:tc>
+        <w:tc>
+          <w:tcPr/>
+          <w:p>
+            <w:pPr>
+              <w:pStyle w:val="Compact"/>
+            </w:pPr>
+            <w:r>
+              <w:t xml:space="preserve">1.94</w:t>
+            </w:r>
+          </w:p>
+        </w:tc>
+        <w:tc>
+          <w:tcPr/>
+          <w:p>
+            <w:pPr>
+              <w:pStyle w:val="Compact"/>
+            </w:pPr>
+            <w:r>
+              <w:t xml:space="preserve">1.83</w:t>
+            </w:r>
+          </w:p>
+        </w:tc>
+        <w:tc>
+          <w:tcPr/>
+          <w:p>
+            <w:pPr>
+              <w:pStyle w:val="Compact"/>
+            </w:pPr>
+            <w:r>
+              <w:t xml:space="preserve">1.95</w:t>
             </w:r>
           </w:p>
         </w:tc>
@@ -1232,40 +1341,7 @@
               <w:pStyle w:val="Compact"/>
             </w:pPr>
             <w:r>
-              <w:t xml:space="preserve">1.86</w:t>
-            </w:r>
-          </w:p>
-        </w:tc>
-        <w:tc>
-          <w:tcPr/>
-          <w:p>
-            <w:pPr>
-              <w:pStyle w:val="Compact"/>
-            </w:pPr>
-            <w:r>
-              <w:t xml:space="preserve">1.97</w:t>
-            </w:r>
-          </w:p>
-        </w:tc>
-        <w:tc>
-          <w:tcPr/>
-          <w:p>
-            <w:pPr>
-              <w:pStyle w:val="Compact"/>
-            </w:pPr>
-            <w:r>
-              <w:t xml:space="preserve">1.94</w:t>
-            </w:r>
-          </w:p>
-        </w:tc>
-        <w:tc>
-          <w:tcPr/>
-          <w:p>
-            <w:pPr>
-              <w:pStyle w:val="Compact"/>
-            </w:pPr>
-            <w:r>
-              <w:t xml:space="preserve">1.92</w:t>
+              <w:t xml:space="preserve">1.93</w:t>
             </w:r>
           </w:p>
         </w:tc>
@@ -1290,7 +1366,11 @@
         </w:tc>
       </w:tr>
     </w:tbl>
-    <w:sectPr/>
+    <w:sectPr>
+      <w:footnotePr>
+        <w:numRestart w:val="eachSect"/>
+      </w:footnotePr>
+    </w:sectPr>
   </w:body>
 </w:document>
 </file>
@@ -1568,8 +1648,6 @@
     </w:pPr>
     <w:rPr>
       <w:rFonts w:asciiTheme="majorHAnsi" w:cstheme="majorBidi" w:eastAsiaTheme="majorEastAsia" w:hAnsiTheme="majorHAnsi"/>
-      <w:spacing w:val="-10"/>
-      <w:kern w:val="28"/>
       <w:sz w:val="56"/>
       <w:szCs w:val="56"/>
     </w:rPr>
@@ -1582,8 +1660,6 @@
     <w:rsid w:val="00A10FD9"/>
     <w:rPr>
       <w:rFonts w:asciiTheme="majorHAnsi" w:cstheme="majorBidi" w:eastAsiaTheme="majorEastAsia" w:hAnsiTheme="majorHAnsi"/>
-      <w:spacing w:val="-10"/>
-      <w:kern w:val="28"/>
       <w:sz w:val="56"/>
       <w:szCs w:val="56"/>
     </w:rPr>
@@ -1624,23 +1700,31 @@
   </w:style>
   <w:style w:customStyle="1" w:styleId="Author" w:type="paragraph">
     <w:name w:val="Author"/>
+    <w:basedOn w:val="Title"/>
     <w:next w:val="BodyText"/>
     <w:qFormat/>
     <w:pPr>
       <w:keepNext/>
       <w:keepLines/>
-      <w:jc w:val="center"/>
     </w:pPr>
+    <w:rPr>
+      <w:sz w:val="24"/>
+      <w:szCs w:val="24"/>
+    </w:rPr>
   </w:style>
   <w:style w:styleId="Date" w:type="paragraph">
     <w:name w:val="Date"/>
+    <w:basedOn w:val="Title"/>
     <w:next w:val="BodyText"/>
     <w:qFormat/>
     <w:pPr>
       <w:keepNext/>
       <w:keepLines/>
-      <w:jc w:val="center"/>
     </w:pPr>
+    <w:rPr>
+      <w:sz w:val="24"/>
+      <w:szCs w:val="24"/>
+    </w:rPr>
   </w:style>
   <w:style w:customStyle="1" w:styleId="AbstractTitle" w:type="paragraph">
     <w:name w:val="Abstract Title"/>

</xml_diff>